<commit_message>
The Pickle Rick thm ctf was completed
</commit_message>
<xml_diff>
--- a/THM_challenges/Easy/Pickle Rick/Pickle_Rick_Solution_Documentation.docx
+++ b/THM_challenges/Easy/Pickle Rick/Pickle_Rick_Solution_Documentation.docx
@@ -48,45 +48,26 @@
     </w:p>
     <w:p>
       <w:pPr>
-        <w:pStyle w:val="a9"/>
-        <w:numPr>
-          <w:ilvl w:val="0"/>
-          <w:numId w:val="1"/>
-        </w:numPr>
+        <w:ind w:firstLine="720"/>
+      </w:pPr>
+      <w:r>
+        <w:t xml:space="preserve">I began this challenge by </w:t>
+      </w:r>
+      <w:r>
+        <w:t>scanning</w:t>
+      </w:r>
+      <w:r>
+        <w:t xml:space="preserve"> open ports and services versions using Nmap:</w:t>
+      </w:r>
+    </w:p>
+    <w:p>
+      <w:pPr>
+        <w:pStyle w:val="a9"/>
+      </w:pPr>
+      <w:r>
         <w:rPr>
-          <w:b/>
-          <w:bCs/>
-          <w:u w:val="single"/>
+          <w:noProof/>
         </w:rPr>
-      </w:pPr>
-      <w:r>
-        <w:rPr>
-          <w:b/>
-          <w:bCs/>
-          <w:u w:val="single"/>
-        </w:rPr>
-        <w:t>Info gathering:</w:t>
-      </w:r>
-    </w:p>
-    <w:p>
-      <w:pPr>
-        <w:pStyle w:val="a9"/>
-      </w:pPr>
-      <w:r>
-        <w:t xml:space="preserve">I began this challenge by </w:t>
-      </w:r>
-      <w:r>
-        <w:t>scanning</w:t>
-      </w:r>
-      <w:r>
-        <w:t xml:space="preserve"> open ports and services versions using Nmap:</w:t>
-      </w:r>
-    </w:p>
-    <w:p>
-      <w:pPr>
-        <w:pStyle w:val="a9"/>
-      </w:pPr>
-      <w:r>
         <w:drawing>
           <wp:inline distT="0" distB="0" distL="0" distR="0" wp14:anchorId="740AE865" wp14:editId="61826A71">
             <wp:extent cx="5906012" cy="2400508"/>
@@ -140,6 +121,9 @@
         <w:pStyle w:val="a9"/>
       </w:pPr>
       <w:r>
+        <w:rPr>
+          <w:noProof/>
+        </w:rPr>
         <w:drawing>
           <wp:inline distT="0" distB="0" distL="0" distR="0" wp14:anchorId="5C3E1309" wp14:editId="0A462829">
             <wp:extent cx="6638290" cy="2843866"/>
@@ -385,90 +369,1517 @@
       <w:pPr>
         <w:pStyle w:val="a9"/>
       </w:pPr>
-    </w:p>
-    <w:p>
-      <w:pPr>
-        <w:pStyle w:val="a9"/>
-        <w:numPr>
-          <w:ilvl w:val="0"/>
-          <w:numId w:val="1"/>
-        </w:numPr>
+      <w:r>
         <w:rPr>
-          <w:b/>
-          <w:bCs/>
-          <w:u w:val="single"/>
+          <w:noProof/>
         </w:rPr>
+        <w:drawing>
+          <wp:inline distT="0" distB="0" distL="0" distR="0" wp14:anchorId="033EA643" wp14:editId="157D006E">
+            <wp:extent cx="5734547" cy="666808"/>
+            <wp:effectExtent l="0" t="0" r="0" b="0"/>
+            <wp:docPr id="1343285882" name="תמונה 1"/>
+            <wp:cNvGraphicFramePr>
+              <a:graphicFrameLocks xmlns:a="http://schemas.openxmlformats.org/drawingml/2006/main" noChangeAspect="1"/>
+            </wp:cNvGraphicFramePr>
+            <a:graphic xmlns:a="http://schemas.openxmlformats.org/drawingml/2006/main">
+              <a:graphicData uri="http://schemas.openxmlformats.org/drawingml/2006/picture">
+                <pic:pic xmlns:pic="http://schemas.openxmlformats.org/drawingml/2006/picture">
+                  <pic:nvPicPr>
+                    <pic:cNvPr id="1343285882" name=""/>
+                    <pic:cNvPicPr/>
+                  </pic:nvPicPr>
+                  <pic:blipFill>
+                    <a:blip r:embed="rId10"/>
+                    <a:stretch>
+                      <a:fillRect/>
+                    </a:stretch>
+                  </pic:blipFill>
+                  <pic:spPr>
+                    <a:xfrm>
+                      <a:off x="0" y="0"/>
+                      <a:ext cx="5734547" cy="666808"/>
+                    </a:xfrm>
+                    <a:prstGeom prst="rect">
+                      <a:avLst/>
+                    </a:prstGeom>
+                  </pic:spPr>
+                </pic:pic>
+              </a:graphicData>
+            </a:graphic>
+          </wp:inline>
+        </w:drawing>
+      </w:r>
+    </w:p>
+    <w:p>
+      <w:pPr>
+        <w:pStyle w:val="a9"/>
+      </w:pPr>
+      <w:r>
+        <w:t xml:space="preserve">I </w:t>
+      </w:r>
+      <w:r>
+        <w:t>caught the login request using Burpsuite:</w:t>
+      </w:r>
+    </w:p>
+    <w:p>
+      <w:pPr>
+        <w:pStyle w:val="a9"/>
       </w:pPr>
       <w:r>
         <w:rPr>
-          <w:b/>
-          <w:bCs/>
-          <w:u w:val="single"/>
+          <w:noProof/>
         </w:rPr>
-        <w:t>Vulnerability detection:</w:t>
-      </w:r>
-    </w:p>
-    <w:p>
-      <w:pPr>
-        <w:ind w:left="720"/>
-      </w:pPr>
-    </w:p>
-    <w:p>
-      <w:pPr>
-        <w:pStyle w:val="a9"/>
-        <w:numPr>
-          <w:ilvl w:val="0"/>
-          <w:numId w:val="1"/>
-        </w:numPr>
+        <w:drawing>
+          <wp:inline distT="0" distB="0" distL="0" distR="0" wp14:anchorId="457D1EF3" wp14:editId="4C45665E">
+            <wp:extent cx="3996690" cy="1987262"/>
+            <wp:effectExtent l="0" t="0" r="3810" b="0"/>
+            <wp:docPr id="462203332" name="תמונה 1"/>
+            <wp:cNvGraphicFramePr>
+              <a:graphicFrameLocks xmlns:a="http://schemas.openxmlformats.org/drawingml/2006/main" noChangeAspect="1"/>
+            </wp:cNvGraphicFramePr>
+            <a:graphic xmlns:a="http://schemas.openxmlformats.org/drawingml/2006/main">
+              <a:graphicData uri="http://schemas.openxmlformats.org/drawingml/2006/picture">
+                <pic:pic xmlns:pic="http://schemas.openxmlformats.org/drawingml/2006/picture">
+                  <pic:nvPicPr>
+                    <pic:cNvPr id="462203332" name=""/>
+                    <pic:cNvPicPr/>
+                  </pic:nvPicPr>
+                  <pic:blipFill>
+                    <a:blip r:embed="rId11"/>
+                    <a:stretch>
+                      <a:fillRect/>
+                    </a:stretch>
+                  </pic:blipFill>
+                  <pic:spPr>
+                    <a:xfrm>
+                      <a:off x="0" y="0"/>
+                      <a:ext cx="4027390" cy="2002527"/>
+                    </a:xfrm>
+                    <a:prstGeom prst="rect">
+                      <a:avLst/>
+                    </a:prstGeom>
+                  </pic:spPr>
+                </pic:pic>
+              </a:graphicData>
+            </a:graphic>
+          </wp:inline>
+        </w:drawing>
+      </w:r>
+    </w:p>
+    <w:p>
+      <w:pPr>
+        <w:pStyle w:val="a9"/>
+      </w:pPr>
+      <w:r>
+        <w:t>I saw that this is http post request, a fact that made me think to maybe execute a wordlist attack over the login form with the username that I have</w:t>
+      </w:r>
+      <w:r>
+        <w:t xml:space="preserve"> using </w:t>
+      </w:r>
+      <w:r>
+        <w:t>hydra too</w:t>
+      </w:r>
+      <w:r>
+        <w:t xml:space="preserve">l. After couple of wordlists, I understood that it </w:t>
+      </w:r>
+      <w:r>
+        <w:t>was not</w:t>
+      </w:r>
+      <w:r>
+        <w:t xml:space="preserve"> </w:t>
+      </w:r>
+      <w:r>
+        <w:t>going to</w:t>
+      </w:r>
+      <w:r>
+        <w:t xml:space="preserve"> work. </w:t>
+      </w:r>
+    </w:p>
+    <w:p>
+      <w:pPr>
+        <w:pStyle w:val="a9"/>
+      </w:pPr>
+      <w:r>
+        <w:t xml:space="preserve">Then I thought </w:t>
+      </w:r>
+      <w:r>
+        <w:t>of trying</w:t>
+      </w:r>
+      <w:r>
+        <w:t xml:space="preserve"> </w:t>
+      </w:r>
+      <w:r>
+        <w:t>and using the</w:t>
+      </w:r>
+      <w:r>
+        <w:t xml:space="preserve"> string that appeared in the robots.txt </w:t>
+      </w:r>
+      <w:r>
+        <w:t xml:space="preserve">as the password </w:t>
+      </w:r>
+      <w:r>
+        <w:t>and surprisingly it worked</w:t>
+      </w:r>
+      <w:r>
+        <w:t>!</w:t>
+      </w:r>
+    </w:p>
+    <w:p>
+      <w:pPr>
+        <w:pStyle w:val="a9"/>
+      </w:pPr>
+      <w:r>
+        <w:t>After login, I was moved to this page:</w:t>
+      </w:r>
+    </w:p>
+    <w:p>
+      <w:pPr>
+        <w:pStyle w:val="a9"/>
+      </w:pPr>
+      <w:r>
         <w:rPr>
-          <w:b/>
-          <w:bCs/>
-          <w:u w:val="single"/>
+          <w:noProof/>
         </w:rPr>
+        <w:drawing>
+          <wp:inline distT="0" distB="0" distL="0" distR="0" wp14:anchorId="4D7FC162" wp14:editId="4050EDE4">
+            <wp:extent cx="5595227" cy="1809750"/>
+            <wp:effectExtent l="0" t="0" r="5715" b="0"/>
+            <wp:docPr id="972588848" name="תמונה 1" descr="תמונה שמכילה טקסט, צילום מסך, גופן, קו&#10;&#10;תוכן בינה מלאכותית גנרטיבית עשוי להיות שגוי."/>
+            <wp:cNvGraphicFramePr>
+              <a:graphicFrameLocks xmlns:a="http://schemas.openxmlformats.org/drawingml/2006/main" noChangeAspect="1"/>
+            </wp:cNvGraphicFramePr>
+            <a:graphic xmlns:a="http://schemas.openxmlformats.org/drawingml/2006/main">
+              <a:graphicData uri="http://schemas.openxmlformats.org/drawingml/2006/picture">
+                <pic:pic xmlns:pic="http://schemas.openxmlformats.org/drawingml/2006/picture">
+                  <pic:nvPicPr>
+                    <pic:cNvPr id="972588848" name="תמונה 1" descr="תמונה שמכילה טקסט, צילום מסך, גופן, קו&#10;&#10;תוכן בינה מלאכותית גנרטיבית עשוי להיות שגוי."/>
+                    <pic:cNvPicPr/>
+                  </pic:nvPicPr>
+                  <pic:blipFill>
+                    <a:blip r:embed="rId12"/>
+                    <a:stretch>
+                      <a:fillRect/>
+                    </a:stretch>
+                  </pic:blipFill>
+                  <pic:spPr>
+                    <a:xfrm>
+                      <a:off x="0" y="0"/>
+                      <a:ext cx="5617351" cy="1816906"/>
+                    </a:xfrm>
+                    <a:prstGeom prst="rect">
+                      <a:avLst/>
+                    </a:prstGeom>
+                  </pic:spPr>
+                </pic:pic>
+              </a:graphicData>
+            </a:graphic>
+          </wp:inline>
+        </w:drawing>
+      </w:r>
+    </w:p>
+    <w:p>
+      <w:pPr>
+        <w:pStyle w:val="a9"/>
+      </w:pPr>
+      <w:r>
+        <w:lastRenderedPageBreak/>
+        <w:t xml:space="preserve">I navigated between the </w:t>
+      </w:r>
+      <w:r>
+        <w:t>pages</w:t>
+      </w:r>
+      <w:r>
+        <w:t>,</w:t>
+      </w:r>
+      <w:r>
+        <w:t xml:space="preserve"> and </w:t>
+      </w:r>
+      <w:r>
+        <w:t xml:space="preserve">I realized that </w:t>
+      </w:r>
+      <w:r>
+        <w:t xml:space="preserve">“Potions”, “Creatures”, “Potions” and “Beth Clone Notes” moved me to “denied.php” page </w:t>
+      </w:r>
+      <w:r>
+        <w:t xml:space="preserve">(probably I doesn’t have </w:t>
+      </w:r>
+      <w:r>
+        <w:t>permission to be there</w:t>
+      </w:r>
+      <w:r>
+        <w:t>)</w:t>
+      </w:r>
+      <w:r>
+        <w:t>:</w:t>
+      </w:r>
+    </w:p>
+    <w:p>
+      <w:pPr>
+        <w:pStyle w:val="a9"/>
       </w:pPr>
       <w:r>
         <w:rPr>
-          <w:b/>
-          <w:bCs/>
-          <w:u w:val="single"/>
+          <w:noProof/>
         </w:rPr>
-        <w:t>Attacking:</w:t>
-      </w:r>
-    </w:p>
-    <w:p>
-      <w:pPr>
-        <w:pStyle w:val="a9"/>
-      </w:pPr>
-    </w:p>
-    <w:p>
-      <w:pPr>
-        <w:pStyle w:val="a9"/>
-        <w:numPr>
-          <w:ilvl w:val="0"/>
-          <w:numId w:val="1"/>
-        </w:numPr>
+        <w:drawing>
+          <wp:inline distT="0" distB="0" distL="0" distR="0" wp14:anchorId="02918FEC" wp14:editId="6A61FE18">
+            <wp:extent cx="4057650" cy="2981660"/>
+            <wp:effectExtent l="0" t="0" r="0" b="9525"/>
+            <wp:docPr id="1133122912" name="תמונה 1"/>
+            <wp:cNvGraphicFramePr>
+              <a:graphicFrameLocks xmlns:a="http://schemas.openxmlformats.org/drawingml/2006/main" noChangeAspect="1"/>
+            </wp:cNvGraphicFramePr>
+            <a:graphic xmlns:a="http://schemas.openxmlformats.org/drawingml/2006/main">
+              <a:graphicData uri="http://schemas.openxmlformats.org/drawingml/2006/picture">
+                <pic:pic xmlns:pic="http://schemas.openxmlformats.org/drawingml/2006/picture">
+                  <pic:nvPicPr>
+                    <pic:cNvPr id="1133122912" name=""/>
+                    <pic:cNvPicPr/>
+                  </pic:nvPicPr>
+                  <pic:blipFill>
+                    <a:blip r:embed="rId13"/>
+                    <a:stretch>
+                      <a:fillRect/>
+                    </a:stretch>
+                  </pic:blipFill>
+                  <pic:spPr>
+                    <a:xfrm>
+                      <a:off x="0" y="0"/>
+                      <a:ext cx="4061465" cy="2984463"/>
+                    </a:xfrm>
+                    <a:prstGeom prst="rect">
+                      <a:avLst/>
+                    </a:prstGeom>
+                  </pic:spPr>
+                </pic:pic>
+              </a:graphicData>
+            </a:graphic>
+          </wp:inline>
+        </w:drawing>
+      </w:r>
+    </w:p>
+    <w:p>
+      <w:pPr>
+        <w:pStyle w:val="a9"/>
+      </w:pPr>
+      <w:r>
+        <w:t>And in the “Commands” I was in the “portal.php” page</w:t>
+      </w:r>
+      <w:r>
+        <w:t>:</w:t>
+      </w:r>
+    </w:p>
+    <w:p>
+      <w:pPr>
+        <w:pStyle w:val="a9"/>
+      </w:pPr>
+      <w:r>
         <w:rPr>
-          <w:b/>
-          <w:bCs/>
-          <w:u w:val="single"/>
+          <w:noProof/>
         </w:rPr>
+        <w:drawing>
+          <wp:inline distT="0" distB="0" distL="0" distR="0" wp14:anchorId="5F92F561" wp14:editId="2425E010">
+            <wp:extent cx="4556760" cy="2442800"/>
+            <wp:effectExtent l="0" t="0" r="0" b="0"/>
+            <wp:docPr id="554373780" name="תמונה 1" descr="תמונה שמכילה טקסט, צילום מסך, תוכנה, תכונות מולטימדיה&#10;&#10;תוכן בינה מלאכותית גנרטיבית עשוי להיות שגוי."/>
+            <wp:cNvGraphicFramePr>
+              <a:graphicFrameLocks xmlns:a="http://schemas.openxmlformats.org/drawingml/2006/main" noChangeAspect="1"/>
+            </wp:cNvGraphicFramePr>
+            <a:graphic xmlns:a="http://schemas.openxmlformats.org/drawingml/2006/main">
+              <a:graphicData uri="http://schemas.openxmlformats.org/drawingml/2006/picture">
+                <pic:pic xmlns:pic="http://schemas.openxmlformats.org/drawingml/2006/picture">
+                  <pic:nvPicPr>
+                    <pic:cNvPr id="554373780" name="תמונה 1" descr="תמונה שמכילה טקסט, צילום מסך, תוכנה, תכונות מולטימדיה&#10;&#10;תוכן בינה מלאכותית גנרטיבית עשוי להיות שגוי."/>
+                    <pic:cNvPicPr/>
+                  </pic:nvPicPr>
+                  <pic:blipFill>
+                    <a:blip r:embed="rId14"/>
+                    <a:stretch>
+                      <a:fillRect/>
+                    </a:stretch>
+                  </pic:blipFill>
+                  <pic:spPr>
+                    <a:xfrm>
+                      <a:off x="0" y="0"/>
+                      <a:ext cx="4561645" cy="2445419"/>
+                    </a:xfrm>
+                    <a:prstGeom prst="rect">
+                      <a:avLst/>
+                    </a:prstGeom>
+                  </pic:spPr>
+                </pic:pic>
+              </a:graphicData>
+            </a:graphic>
+          </wp:inline>
+        </w:drawing>
+      </w:r>
+    </w:p>
+    <w:p>
+      <w:pPr>
+        <w:pStyle w:val="a9"/>
+      </w:pPr>
+      <w:r>
+        <w:t xml:space="preserve">I tried to write </w:t>
+      </w:r>
+      <w:r>
+        <w:t>the famous “whoami” command to check if it’s a linux based and it actually it:</w:t>
+      </w:r>
+    </w:p>
+    <w:p>
+      <w:pPr>
+        <w:pStyle w:val="a9"/>
       </w:pPr>
       <w:r>
         <w:rPr>
-          <w:b/>
-          <w:bCs/>
-          <w:u w:val="single"/>
+          <w:noProof/>
         </w:rPr>
-        <w:t>Privilege escalation:</w:t>
-      </w:r>
-    </w:p>
-    <w:p>
-      <w:pPr>
+        <w:drawing>
+          <wp:inline distT="0" distB="0" distL="0" distR="0" wp14:anchorId="669BC278" wp14:editId="2846A53C">
+            <wp:extent cx="1287780" cy="1090014"/>
+            <wp:effectExtent l="0" t="0" r="7620" b="0"/>
+            <wp:docPr id="236469426" name="תמונה 1" descr="תמונה שמכילה טקסט, צילום מסך, גופן, לוגו&#10;&#10;תוכן בינה מלאכותית גנרטיבית עשוי להיות שגוי."/>
+            <wp:cNvGraphicFramePr>
+              <a:graphicFrameLocks xmlns:a="http://schemas.openxmlformats.org/drawingml/2006/main" noChangeAspect="1"/>
+            </wp:cNvGraphicFramePr>
+            <a:graphic xmlns:a="http://schemas.openxmlformats.org/drawingml/2006/main">
+              <a:graphicData uri="http://schemas.openxmlformats.org/drawingml/2006/picture">
+                <pic:pic xmlns:pic="http://schemas.openxmlformats.org/drawingml/2006/picture">
+                  <pic:nvPicPr>
+                    <pic:cNvPr id="236469426" name="תמונה 1" descr="תמונה שמכילה טקסט, צילום מסך, גופן, לוגו&#10;&#10;תוכן בינה מלאכותית גנרטיבית עשוי להיות שגוי."/>
+                    <pic:cNvPicPr/>
+                  </pic:nvPicPr>
+                  <pic:blipFill>
+                    <a:blip r:embed="rId15"/>
+                    <a:stretch>
+                      <a:fillRect/>
+                    </a:stretch>
+                  </pic:blipFill>
+                  <pic:spPr>
+                    <a:xfrm>
+                      <a:off x="0" y="0"/>
+                      <a:ext cx="1288436" cy="1090569"/>
+                    </a:xfrm>
+                    <a:prstGeom prst="rect">
+                      <a:avLst/>
+                    </a:prstGeom>
+                  </pic:spPr>
+                </pic:pic>
+              </a:graphicData>
+            </a:graphic>
+          </wp:inline>
+        </w:drawing>
+      </w:r>
+    </w:p>
+    <w:p>
+      <w:pPr>
+        <w:pStyle w:val="a9"/>
+      </w:pPr>
+      <w:r>
+        <w:rPr>
+          <w:noProof/>
+        </w:rPr>
+        <w:drawing>
+          <wp:inline distT="0" distB="0" distL="0" distR="0" wp14:anchorId="12B07696" wp14:editId="5E3491A9">
+            <wp:extent cx="1154430" cy="777472"/>
+            <wp:effectExtent l="0" t="0" r="7620" b="3810"/>
+            <wp:docPr id="1360287931" name="תמונה 1" descr="תמונה שמכילה טקסט, גופן, צילום מסך, לבן&#10;&#10;תוכן בינה מלאכותית גנרטיבית עשוי להיות שגוי."/>
+            <wp:cNvGraphicFramePr>
+              <a:graphicFrameLocks xmlns:a="http://schemas.openxmlformats.org/drawingml/2006/main" noChangeAspect="1"/>
+            </wp:cNvGraphicFramePr>
+            <a:graphic xmlns:a="http://schemas.openxmlformats.org/drawingml/2006/main">
+              <a:graphicData uri="http://schemas.openxmlformats.org/drawingml/2006/picture">
+                <pic:pic xmlns:pic="http://schemas.openxmlformats.org/drawingml/2006/picture">
+                  <pic:nvPicPr>
+                    <pic:cNvPr id="1360287931" name="תמונה 1" descr="תמונה שמכילה טקסט, גופן, צילום מסך, לבן&#10;&#10;תוכן בינה מלאכותית גנרטיבית עשוי להיות שגוי."/>
+                    <pic:cNvPicPr/>
+                  </pic:nvPicPr>
+                  <pic:blipFill>
+                    <a:blip r:embed="rId16"/>
+                    <a:stretch>
+                      <a:fillRect/>
+                    </a:stretch>
+                  </pic:blipFill>
+                  <pic:spPr>
+                    <a:xfrm>
+                      <a:off x="0" y="0"/>
+                      <a:ext cx="1156848" cy="779100"/>
+                    </a:xfrm>
+                    <a:prstGeom prst="rect">
+                      <a:avLst/>
+                    </a:prstGeom>
+                  </pic:spPr>
+                </pic:pic>
+              </a:graphicData>
+            </a:graphic>
+          </wp:inline>
+        </w:drawing>
+      </w:r>
+    </w:p>
+    <w:p>
+      <w:pPr>
+        <w:pStyle w:val="a9"/>
+      </w:pPr>
+      <w:r>
+        <w:t xml:space="preserve">But before </w:t>
+      </w:r>
+      <w:r>
+        <w:t xml:space="preserve">continued </w:t>
+      </w:r>
+      <w:r>
+        <w:t>with this shell, I opened the inspector and found this utf-8 encryption:</w:t>
+      </w:r>
+      <w:r>
+        <w:rPr>
+          <w:noProof/>
+        </w:rPr>
+        <w:drawing>
+          <wp:inline distT="0" distB="0" distL="0" distR="0" wp14:anchorId="643FC304" wp14:editId="206957B4">
+            <wp:extent cx="6191250" cy="412750"/>
+            <wp:effectExtent l="0" t="0" r="0" b="6350"/>
+            <wp:docPr id="741906809" name="תמונה 1"/>
+            <wp:cNvGraphicFramePr>
+              <a:graphicFrameLocks xmlns:a="http://schemas.openxmlformats.org/drawingml/2006/main" noChangeAspect="1"/>
+            </wp:cNvGraphicFramePr>
+            <a:graphic xmlns:a="http://schemas.openxmlformats.org/drawingml/2006/main">
+              <a:graphicData uri="http://schemas.openxmlformats.org/drawingml/2006/picture">
+                <pic:pic xmlns:pic="http://schemas.openxmlformats.org/drawingml/2006/picture">
+                  <pic:nvPicPr>
+                    <pic:cNvPr id="741906809" name=""/>
+                    <pic:cNvPicPr/>
+                  </pic:nvPicPr>
+                  <pic:blipFill>
+                    <a:blip r:embed="rId17"/>
+                    <a:stretch>
+                      <a:fillRect/>
+                    </a:stretch>
+                  </pic:blipFill>
+                  <pic:spPr>
+                    <a:xfrm>
+                      <a:off x="0" y="0"/>
+                      <a:ext cx="6203355" cy="413557"/>
+                    </a:xfrm>
+                    <a:prstGeom prst="rect">
+                      <a:avLst/>
+                    </a:prstGeom>
+                  </pic:spPr>
+                </pic:pic>
+              </a:graphicData>
+            </a:graphic>
+          </wp:inline>
+        </w:drawing>
+      </w:r>
+    </w:p>
+    <w:p>
+      <w:pPr>
+        <w:pStyle w:val="a9"/>
+      </w:pPr>
+      <w:r>
+        <w:t xml:space="preserve">I decoded with </w:t>
+      </w:r>
+      <w:r>
+        <w:t>base64,</w:t>
+      </w:r>
+      <w:r>
+        <w:t xml:space="preserve"> and </w:t>
+      </w:r>
+      <w:r>
+        <w:t xml:space="preserve">it led me to </w:t>
+      </w:r>
+      <w:r>
+        <w:t>another encryption</w:t>
+      </w:r>
+      <w:r>
+        <w:t>:</w:t>
+      </w:r>
+    </w:p>
+    <w:p>
+      <w:pPr>
+        <w:pStyle w:val="a9"/>
+      </w:pPr>
+      <w:r>
+        <w:rPr>
+          <w:noProof/>
+        </w:rPr>
+        <w:lastRenderedPageBreak/>
+        <w:drawing>
+          <wp:inline distT="0" distB="0" distL="0" distR="0" wp14:anchorId="606B0721" wp14:editId="46B58194">
+            <wp:extent cx="5352575" cy="2777490"/>
+            <wp:effectExtent l="0" t="0" r="635" b="3810"/>
+            <wp:docPr id="1226646685" name="תמונה 1"/>
+            <wp:cNvGraphicFramePr>
+              <a:graphicFrameLocks xmlns:a="http://schemas.openxmlformats.org/drawingml/2006/main" noChangeAspect="1"/>
+            </wp:cNvGraphicFramePr>
+            <a:graphic xmlns:a="http://schemas.openxmlformats.org/drawingml/2006/main">
+              <a:graphicData uri="http://schemas.openxmlformats.org/drawingml/2006/picture">
+                <pic:pic xmlns:pic="http://schemas.openxmlformats.org/drawingml/2006/picture">
+                  <pic:nvPicPr>
+                    <pic:cNvPr id="1226646685" name=""/>
+                    <pic:cNvPicPr/>
+                  </pic:nvPicPr>
+                  <pic:blipFill>
+                    <a:blip r:embed="rId18"/>
+                    <a:stretch>
+                      <a:fillRect/>
+                    </a:stretch>
+                  </pic:blipFill>
+                  <pic:spPr>
+                    <a:xfrm>
+                      <a:off x="0" y="0"/>
+                      <a:ext cx="5366614" cy="2784775"/>
+                    </a:xfrm>
+                    <a:prstGeom prst="rect">
+                      <a:avLst/>
+                    </a:prstGeom>
+                  </pic:spPr>
+                </pic:pic>
+              </a:graphicData>
+            </a:graphic>
+          </wp:inline>
+        </w:drawing>
+      </w:r>
+    </w:p>
+    <w:p>
+      <w:pPr>
+        <w:pStyle w:val="a9"/>
+      </w:pPr>
+      <w:r>
+        <w:t xml:space="preserve">I </w:t>
+      </w:r>
+      <w:r>
+        <w:t xml:space="preserve">decoded the </w:t>
+      </w:r>
+      <w:r>
+        <w:t>decryption,</w:t>
+      </w:r>
+      <w:r>
+        <w:t xml:space="preserve"> </w:t>
+      </w:r>
+      <w:r>
+        <w:t>and it led me to another one, and so on until I reached this message:</w:t>
+      </w:r>
+    </w:p>
+    <w:p>
+      <w:pPr>
+        <w:pStyle w:val="a9"/>
+      </w:pPr>
+      <w:r>
+        <w:rPr>
+          <w:noProof/>
+        </w:rPr>
+        <w:drawing>
+          <wp:inline distT="0" distB="0" distL="0" distR="0" wp14:anchorId="4C9DF841" wp14:editId="2EF32DB4">
+            <wp:extent cx="5468620" cy="2818407"/>
+            <wp:effectExtent l="0" t="0" r="0" b="1270"/>
+            <wp:docPr id="2079692707" name="תמונה 1"/>
+            <wp:cNvGraphicFramePr>
+              <a:graphicFrameLocks xmlns:a="http://schemas.openxmlformats.org/drawingml/2006/main" noChangeAspect="1"/>
+            </wp:cNvGraphicFramePr>
+            <a:graphic xmlns:a="http://schemas.openxmlformats.org/drawingml/2006/main">
+              <a:graphicData uri="http://schemas.openxmlformats.org/drawingml/2006/picture">
+                <pic:pic xmlns:pic="http://schemas.openxmlformats.org/drawingml/2006/picture">
+                  <pic:nvPicPr>
+                    <pic:cNvPr id="2079692707" name=""/>
+                    <pic:cNvPicPr/>
+                  </pic:nvPicPr>
+                  <pic:blipFill>
+                    <a:blip r:embed="rId19"/>
+                    <a:stretch>
+                      <a:fillRect/>
+                    </a:stretch>
+                  </pic:blipFill>
+                  <pic:spPr>
+                    <a:xfrm>
+                      <a:off x="0" y="0"/>
+                      <a:ext cx="5481162" cy="2824871"/>
+                    </a:xfrm>
+                    <a:prstGeom prst="rect">
+                      <a:avLst/>
+                    </a:prstGeom>
+                  </pic:spPr>
+                </pic:pic>
+              </a:graphicData>
+            </a:graphic>
+          </wp:inline>
+        </w:drawing>
+      </w:r>
+    </w:p>
+    <w:p>
+      <w:pPr>
+        <w:pStyle w:val="a9"/>
+      </w:pPr>
+      <w:r>
+        <w:t>Then I understood that it led me to a “rabbit hole”</w:t>
+      </w:r>
+      <w:r>
+        <w:t>.</w:t>
+      </w:r>
+    </w:p>
+    <w:p>
+      <w:pPr>
+        <w:pStyle w:val="a9"/>
+      </w:pPr>
+      <w:r>
+        <w:t xml:space="preserve">I returned back to the commands </w:t>
+      </w:r>
+      <w:r>
+        <w:t>page,</w:t>
+      </w:r>
+      <w:r>
+        <w:t xml:space="preserve"> and I </w:t>
+      </w:r>
+      <w:r>
+        <w:t>created this nc shell over my machine:</w:t>
+      </w:r>
+    </w:p>
+    <w:p>
+      <w:pPr>
+        <w:pStyle w:val="a9"/>
+      </w:pPr>
+      <w:r>
+        <w:t>I created a nc listener in my machine:</w:t>
+      </w:r>
+    </w:p>
+    <w:p>
+      <w:pPr>
+        <w:pStyle w:val="a9"/>
+      </w:pPr>
+      <w:r>
+        <w:rPr>
+          <w:noProof/>
+        </w:rPr>
+        <w:drawing>
+          <wp:inline distT="0" distB="0" distL="0" distR="0" wp14:anchorId="26B1B1E4" wp14:editId="0A02325A">
+            <wp:extent cx="1771804" cy="800169"/>
+            <wp:effectExtent l="0" t="0" r="0" b="0"/>
+            <wp:docPr id="1129289801" name="תמונה 1"/>
+            <wp:cNvGraphicFramePr>
+              <a:graphicFrameLocks xmlns:a="http://schemas.openxmlformats.org/drawingml/2006/main" noChangeAspect="1"/>
+            </wp:cNvGraphicFramePr>
+            <a:graphic xmlns:a="http://schemas.openxmlformats.org/drawingml/2006/main">
+              <a:graphicData uri="http://schemas.openxmlformats.org/drawingml/2006/picture">
+                <pic:pic xmlns:pic="http://schemas.openxmlformats.org/drawingml/2006/picture">
+                  <pic:nvPicPr>
+                    <pic:cNvPr id="1129289801" name=""/>
+                    <pic:cNvPicPr/>
+                  </pic:nvPicPr>
+                  <pic:blipFill>
+                    <a:blip r:embed="rId20"/>
+                    <a:stretch>
+                      <a:fillRect/>
+                    </a:stretch>
+                  </pic:blipFill>
+                  <pic:spPr>
+                    <a:xfrm>
+                      <a:off x="0" y="0"/>
+                      <a:ext cx="1771804" cy="800169"/>
+                    </a:xfrm>
+                    <a:prstGeom prst="rect">
+                      <a:avLst/>
+                    </a:prstGeom>
+                  </pic:spPr>
+                </pic:pic>
+              </a:graphicData>
+            </a:graphic>
+          </wp:inline>
+        </w:drawing>
+      </w:r>
+    </w:p>
+    <w:p>
+      <w:pPr>
+        <w:pStyle w:val="a9"/>
+      </w:pPr>
+      <w:r>
+        <w:t>a</w:t>
+      </w:r>
+      <w:r>
+        <w:t xml:space="preserve">nd then I </w:t>
+      </w:r>
+      <w:r>
+        <w:t xml:space="preserve">entered this </w:t>
+      </w:r>
+      <w:r>
+        <w:t xml:space="preserve">command </w:t>
+      </w:r>
+      <w:r>
+        <w:t>on</w:t>
+      </w:r>
+      <w:r>
+        <w:t xml:space="preserve"> the commands page to send request to the listener:</w:t>
+      </w:r>
+    </w:p>
+    <w:p>
+      <w:pPr>
+        <w:pStyle w:val="a9"/>
+      </w:pPr>
+      <w:r>
+        <w:rPr>
+          <w:noProof/>
+        </w:rPr>
+        <w:drawing>
+          <wp:inline distT="0" distB="0" distL="0" distR="0" wp14:anchorId="25A45928" wp14:editId="03E2B3CE">
+            <wp:extent cx="5734547" cy="1333616"/>
+            <wp:effectExtent l="0" t="0" r="0" b="0"/>
+            <wp:docPr id="1952502320" name="תמונה 1" descr="תמונה שמכילה טקסט, צילום מסך, קו, גופן&#10;&#10;תוכן בינה מלאכותית גנרטיבית עשוי להיות שגוי."/>
+            <wp:cNvGraphicFramePr>
+              <a:graphicFrameLocks xmlns:a="http://schemas.openxmlformats.org/drawingml/2006/main" noChangeAspect="1"/>
+            </wp:cNvGraphicFramePr>
+            <a:graphic xmlns:a="http://schemas.openxmlformats.org/drawingml/2006/main">
+              <a:graphicData uri="http://schemas.openxmlformats.org/drawingml/2006/picture">
+                <pic:pic xmlns:pic="http://schemas.openxmlformats.org/drawingml/2006/picture">
+                  <pic:nvPicPr>
+                    <pic:cNvPr id="1952502320" name="תמונה 1" descr="תמונה שמכילה טקסט, צילום מסך, קו, גופן&#10;&#10;תוכן בינה מלאכותית גנרטיבית עשוי להיות שגוי."/>
+                    <pic:cNvPicPr/>
+                  </pic:nvPicPr>
+                  <pic:blipFill>
+                    <a:blip r:embed="rId21"/>
+                    <a:stretch>
+                      <a:fillRect/>
+                    </a:stretch>
+                  </pic:blipFill>
+                  <pic:spPr>
+                    <a:xfrm>
+                      <a:off x="0" y="0"/>
+                      <a:ext cx="5734547" cy="1333616"/>
+                    </a:xfrm>
+                    <a:prstGeom prst="rect">
+                      <a:avLst/>
+                    </a:prstGeom>
+                  </pic:spPr>
+                </pic:pic>
+              </a:graphicData>
+            </a:graphic>
+          </wp:inline>
+        </w:drawing>
+      </w:r>
+    </w:p>
+    <w:p>
+      <w:pPr>
+        <w:pStyle w:val="a9"/>
+      </w:pPr>
+      <w:r>
+        <w:t xml:space="preserve">And after pressing on the “Execute” button the rev shell </w:t>
+      </w:r>
+      <w:r>
+        <w:t>failed to execute. I figured this out that probably there is a thing that check for this command and prevent me from doing this</w:t>
+      </w:r>
+      <w:r>
+        <w:t xml:space="preserve">, so I </w:t>
+      </w:r>
+      <w:r>
+        <w:t>runed this command using the “bash” command in order to “cover” the command</w:t>
+      </w:r>
+      <w:r>
+        <w:t>:</w:t>
+      </w:r>
+    </w:p>
+    <w:p>
+      <w:pPr>
+        <w:pStyle w:val="a9"/>
+      </w:pPr>
+    </w:p>
+    <w:p>
+      <w:pPr>
+        <w:pStyle w:val="a9"/>
+      </w:pPr>
+      <w:r>
+        <w:rPr>
+          <w:noProof/>
+        </w:rPr>
+        <w:lastRenderedPageBreak/>
+        <w:drawing>
+          <wp:inline distT="0" distB="0" distL="0" distR="0" wp14:anchorId="15CE2902" wp14:editId="4969311C">
+            <wp:extent cx="5563082" cy="903048"/>
+            <wp:effectExtent l="0" t="0" r="0" b="0"/>
+            <wp:docPr id="1580294055" name="תמונה 1" descr="תמונה שמכילה טקסט, צילום מסך, קו, גופן&#10;&#10;תוכן בינה מלאכותית גנרטיבית עשוי להיות שגוי."/>
+            <wp:cNvGraphicFramePr>
+              <a:graphicFrameLocks xmlns:a="http://schemas.openxmlformats.org/drawingml/2006/main" noChangeAspect="1"/>
+            </wp:cNvGraphicFramePr>
+            <a:graphic xmlns:a="http://schemas.openxmlformats.org/drawingml/2006/main">
+              <a:graphicData uri="http://schemas.openxmlformats.org/drawingml/2006/picture">
+                <pic:pic xmlns:pic="http://schemas.openxmlformats.org/drawingml/2006/picture">
+                  <pic:nvPicPr>
+                    <pic:cNvPr id="1580294055" name="תמונה 1" descr="תמונה שמכילה טקסט, צילום מסך, קו, גופן&#10;&#10;תוכן בינה מלאכותית גנרטיבית עשוי להיות שגוי."/>
+                    <pic:cNvPicPr/>
+                  </pic:nvPicPr>
+                  <pic:blipFill>
+                    <a:blip r:embed="rId22"/>
+                    <a:stretch>
+                      <a:fillRect/>
+                    </a:stretch>
+                  </pic:blipFill>
+                  <pic:spPr>
+                    <a:xfrm>
+                      <a:off x="0" y="0"/>
+                      <a:ext cx="5563082" cy="903048"/>
+                    </a:xfrm>
+                    <a:prstGeom prst="rect">
+                      <a:avLst/>
+                    </a:prstGeom>
+                  </pic:spPr>
+                </pic:pic>
+              </a:graphicData>
+            </a:graphic>
+          </wp:inline>
+        </w:drawing>
+      </w:r>
+    </w:p>
+    <w:p>
+      <w:pPr>
+        <w:pStyle w:val="a9"/>
+      </w:pPr>
+      <w:r>
+        <w:t>and</w:t>
+      </w:r>
+      <w:r>
+        <w:t xml:space="preserve"> </w:t>
+      </w:r>
+      <w:r>
+        <w:t>t</w:t>
+      </w:r>
+      <w:r>
+        <w:t>he shell was created:</w:t>
+      </w:r>
+    </w:p>
+    <w:p>
+      <w:pPr>
+        <w:pStyle w:val="a9"/>
+      </w:pPr>
+      <w:r>
+        <w:rPr>
+          <w:noProof/>
+        </w:rPr>
+        <w:drawing>
+          <wp:inline distT="0" distB="0" distL="0" distR="0" wp14:anchorId="7C97D2F3" wp14:editId="65E7C8A4">
+            <wp:extent cx="3734124" cy="1009738"/>
+            <wp:effectExtent l="0" t="0" r="0" b="0"/>
+            <wp:docPr id="183321037" name="תמונה 1" descr="תמונה שמכילה טקסט, צילום מסך, גופן&#10;&#10;תוכן בינה מלאכותית גנרטיבית עשוי להיות שגוי."/>
+            <wp:cNvGraphicFramePr>
+              <a:graphicFrameLocks xmlns:a="http://schemas.openxmlformats.org/drawingml/2006/main" noChangeAspect="1"/>
+            </wp:cNvGraphicFramePr>
+            <a:graphic xmlns:a="http://schemas.openxmlformats.org/drawingml/2006/main">
+              <a:graphicData uri="http://schemas.openxmlformats.org/drawingml/2006/picture">
+                <pic:pic xmlns:pic="http://schemas.openxmlformats.org/drawingml/2006/picture">
+                  <pic:nvPicPr>
+                    <pic:cNvPr id="183321037" name="תמונה 1" descr="תמונה שמכילה טקסט, צילום מסך, גופן&#10;&#10;תוכן בינה מלאכותית גנרטיבית עשוי להיות שגוי."/>
+                    <pic:cNvPicPr/>
+                  </pic:nvPicPr>
+                  <pic:blipFill>
+                    <a:blip r:embed="rId23"/>
+                    <a:stretch>
+                      <a:fillRect/>
+                    </a:stretch>
+                  </pic:blipFill>
+                  <pic:spPr>
+                    <a:xfrm>
+                      <a:off x="0" y="0"/>
+                      <a:ext cx="3734124" cy="1009738"/>
+                    </a:xfrm>
+                    <a:prstGeom prst="rect">
+                      <a:avLst/>
+                    </a:prstGeom>
+                  </pic:spPr>
+                </pic:pic>
+              </a:graphicData>
+            </a:graphic>
+          </wp:inline>
+        </w:drawing>
+      </w:r>
+    </w:p>
+    <w:p>
+      <w:pPr>
+        <w:pStyle w:val="a9"/>
+      </w:pPr>
+      <w:r>
+        <w:t xml:space="preserve">At this point, I </w:t>
+      </w:r>
+      <w:r>
+        <w:t>started navigating in the target’s machine and I found this file in my current directory</w:t>
+      </w:r>
+      <w:r>
+        <w:t>:</w:t>
+      </w:r>
+    </w:p>
+    <w:p>
+      <w:pPr>
+        <w:pStyle w:val="a9"/>
+      </w:pPr>
+      <w:r>
+        <w:rPr>
+          <w:noProof/>
+        </w:rPr>
+        <w:drawing>
+          <wp:inline distT="0" distB="0" distL="0" distR="0" wp14:anchorId="3AB67892" wp14:editId="76B46E5D">
+            <wp:extent cx="1798476" cy="1371719"/>
+            <wp:effectExtent l="0" t="0" r="0" b="0"/>
+            <wp:docPr id="1870011613" name="תמונה 1" descr="תמונה שמכילה טקסט, צילום מסך, גופן, עיצוב&#10;&#10;תוכן בינה מלאכותית גנרטיבית עשוי להיות שגוי."/>
+            <wp:cNvGraphicFramePr>
+              <a:graphicFrameLocks xmlns:a="http://schemas.openxmlformats.org/drawingml/2006/main" noChangeAspect="1"/>
+            </wp:cNvGraphicFramePr>
+            <a:graphic xmlns:a="http://schemas.openxmlformats.org/drawingml/2006/main">
+              <a:graphicData uri="http://schemas.openxmlformats.org/drawingml/2006/picture">
+                <pic:pic xmlns:pic="http://schemas.openxmlformats.org/drawingml/2006/picture">
+                  <pic:nvPicPr>
+                    <pic:cNvPr id="1870011613" name="תמונה 1" descr="תמונה שמכילה טקסט, צילום מסך, גופן, עיצוב&#10;&#10;תוכן בינה מלאכותית גנרטיבית עשוי להיות שגוי."/>
+                    <pic:cNvPicPr/>
+                  </pic:nvPicPr>
+                  <pic:blipFill>
+                    <a:blip r:embed="rId24"/>
+                    <a:stretch>
+                      <a:fillRect/>
+                    </a:stretch>
+                  </pic:blipFill>
+                  <pic:spPr>
+                    <a:xfrm>
+                      <a:off x="0" y="0"/>
+                      <a:ext cx="1798476" cy="1371719"/>
+                    </a:xfrm>
+                    <a:prstGeom prst="rect">
+                      <a:avLst/>
+                    </a:prstGeom>
+                  </pic:spPr>
+                </pic:pic>
+              </a:graphicData>
+            </a:graphic>
+          </wp:inline>
+        </w:drawing>
+      </w:r>
+    </w:p>
+    <w:p>
+      <w:pPr>
+        <w:pStyle w:val="a9"/>
+      </w:pPr>
+      <w:r>
+        <w:t xml:space="preserve">I </w:t>
+      </w:r>
+      <w:r>
+        <w:t xml:space="preserve">opened this </w:t>
+      </w:r>
+      <w:r>
+        <w:t>file,</w:t>
+      </w:r>
+      <w:r>
+        <w:t xml:space="preserve"> and I found the first </w:t>
+      </w:r>
+      <w:r>
+        <w:t>ingredient</w:t>
+      </w:r>
+      <w:r>
+        <w:t>:</w:t>
+      </w:r>
+    </w:p>
+    <w:p>
+      <w:pPr>
+        <w:pStyle w:val="a9"/>
+      </w:pPr>
+      <w:r>
+        <w:rPr>
+          <w:noProof/>
+        </w:rPr>
+        <w:drawing>
+          <wp:inline distT="0" distB="0" distL="0" distR="0" wp14:anchorId="19E45C36" wp14:editId="7DD94692">
+            <wp:extent cx="2907030" cy="415290"/>
+            <wp:effectExtent l="0" t="0" r="7620" b="3810"/>
+            <wp:docPr id="804769379" name="תמונה 1"/>
+            <wp:cNvGraphicFramePr>
+              <a:graphicFrameLocks xmlns:a="http://schemas.openxmlformats.org/drawingml/2006/main" noChangeAspect="1"/>
+            </wp:cNvGraphicFramePr>
+            <a:graphic xmlns:a="http://schemas.openxmlformats.org/drawingml/2006/main">
+              <a:graphicData uri="http://schemas.openxmlformats.org/drawingml/2006/picture">
+                <pic:pic xmlns:pic="http://schemas.openxmlformats.org/drawingml/2006/picture">
+                  <pic:nvPicPr>
+                    <pic:cNvPr id="804769379" name=""/>
+                    <pic:cNvPicPr/>
+                  </pic:nvPicPr>
+                  <pic:blipFill>
+                    <a:blip r:embed="rId25"/>
+                    <a:stretch>
+                      <a:fillRect/>
+                    </a:stretch>
+                  </pic:blipFill>
+                  <pic:spPr>
+                    <a:xfrm>
+                      <a:off x="0" y="0"/>
+                      <a:ext cx="2918139" cy="416877"/>
+                    </a:xfrm>
+                    <a:prstGeom prst="rect">
+                      <a:avLst/>
+                    </a:prstGeom>
+                  </pic:spPr>
+                </pic:pic>
+              </a:graphicData>
+            </a:graphic>
+          </wp:inline>
+        </w:drawing>
+      </w:r>
+    </w:p>
+    <w:p>
+      <w:pPr>
+        <w:pStyle w:val="a9"/>
+      </w:pPr>
+      <w:r>
+        <w:t>After finding the first ingredient, I saw the “clue.txt” file that contained the following message:</w:t>
+      </w:r>
+    </w:p>
+    <w:p>
+      <w:pPr>
+        <w:pStyle w:val="a9"/>
+      </w:pPr>
+      <w:r>
+        <w:rPr>
+          <w:noProof/>
+        </w:rPr>
+        <w:drawing>
+          <wp:inline distT="0" distB="0" distL="0" distR="0" wp14:anchorId="40DBE385" wp14:editId="4EB43351">
+            <wp:extent cx="3372142" cy="266723"/>
+            <wp:effectExtent l="0" t="0" r="0" b="0"/>
+            <wp:docPr id="376214276" name="תמונה 1"/>
+            <wp:cNvGraphicFramePr>
+              <a:graphicFrameLocks xmlns:a="http://schemas.openxmlformats.org/drawingml/2006/main" noChangeAspect="1"/>
+            </wp:cNvGraphicFramePr>
+            <a:graphic xmlns:a="http://schemas.openxmlformats.org/drawingml/2006/main">
+              <a:graphicData uri="http://schemas.openxmlformats.org/drawingml/2006/picture">
+                <pic:pic xmlns:pic="http://schemas.openxmlformats.org/drawingml/2006/picture">
+                  <pic:nvPicPr>
+                    <pic:cNvPr id="376214276" name=""/>
+                    <pic:cNvPicPr/>
+                  </pic:nvPicPr>
+                  <pic:blipFill>
+                    <a:blip r:embed="rId26"/>
+                    <a:stretch>
+                      <a:fillRect/>
+                    </a:stretch>
+                  </pic:blipFill>
+                  <pic:spPr>
+                    <a:xfrm>
+                      <a:off x="0" y="0"/>
+                      <a:ext cx="3372142" cy="266723"/>
+                    </a:xfrm>
+                    <a:prstGeom prst="rect">
+                      <a:avLst/>
+                    </a:prstGeom>
+                  </pic:spPr>
+                </pic:pic>
+              </a:graphicData>
+            </a:graphic>
+          </wp:inline>
+        </w:drawing>
+      </w:r>
+    </w:p>
+    <w:p>
+      <w:r>
         <w:rPr>
           <w:sz w:val="28"/>
           <w:szCs w:val="28"/>
         </w:rPr>
-      </w:pPr>
+        <w:tab/>
+      </w:r>
+      <w:r>
+        <w:t xml:space="preserve">Afterwards, I </w:t>
+      </w:r>
+      <w:r>
+        <w:t>moved to find the second ingredient</w:t>
+      </w:r>
+      <w:r>
+        <w:t>,</w:t>
+      </w:r>
+      <w:r>
+        <w:t xml:space="preserve"> </w:t>
+      </w:r>
+      <w:r>
+        <w:t>which I guess</w:t>
+      </w:r>
+      <w:r>
+        <w:t>ed</w:t>
+      </w:r>
+      <w:r>
+        <w:t xml:space="preserve"> located </w:t>
+      </w:r>
+      <w:r>
+        <w:t>in “/home/rick”</w:t>
+      </w:r>
+      <w:r>
+        <w:t xml:space="preserve">. I </w:t>
+      </w:r>
+      <w:r>
+        <w:t xml:space="preserve">opened it and </w:t>
+      </w:r>
+      <w:r>
+        <w:tab/>
+        <w:t>found th</w:t>
+      </w:r>
+      <w:r>
+        <w:t>is file:</w:t>
+      </w:r>
+    </w:p>
+    <w:p>
+      <w:pPr>
+        <w:ind w:firstLine="720"/>
+      </w:pPr>
+      <w:r>
+        <w:rPr>
+          <w:noProof/>
+        </w:rPr>
+        <w:t xml:space="preserve"> </w:t>
+      </w:r>
+      <w:r>
+        <w:drawing>
+          <wp:inline distT="0" distB="0" distL="0" distR="0" wp14:anchorId="50D8E97D" wp14:editId="1AFBBEA8">
+            <wp:extent cx="1238357" cy="304826"/>
+            <wp:effectExtent l="0" t="0" r="0" b="0"/>
+            <wp:docPr id="1452118933" name="תמונה 1" descr="תמונה שמכילה טקסט, גופן, צילום מסך, גרפיקה&#10;&#10;תוכן בינה מלאכותית גנרטיבית עשוי להיות שגוי."/>
+            <wp:cNvGraphicFramePr>
+              <a:graphicFrameLocks xmlns:a="http://schemas.openxmlformats.org/drawingml/2006/main" noChangeAspect="1"/>
+            </wp:cNvGraphicFramePr>
+            <a:graphic xmlns:a="http://schemas.openxmlformats.org/drawingml/2006/main">
+              <a:graphicData uri="http://schemas.openxmlformats.org/drawingml/2006/picture">
+                <pic:pic xmlns:pic="http://schemas.openxmlformats.org/drawingml/2006/picture">
+                  <pic:nvPicPr>
+                    <pic:cNvPr id="1452118933" name="תמונה 1" descr="תמונה שמכילה טקסט, גופן, צילום מסך, גרפיקה&#10;&#10;תוכן בינה מלאכותית גנרטיבית עשוי להיות שגוי."/>
+                    <pic:cNvPicPr/>
+                  </pic:nvPicPr>
+                  <pic:blipFill>
+                    <a:blip r:embed="rId27"/>
+                    <a:stretch>
+                      <a:fillRect/>
+                    </a:stretch>
+                  </pic:blipFill>
+                  <pic:spPr>
+                    <a:xfrm>
+                      <a:off x="0" y="0"/>
+                      <a:ext cx="1238357" cy="304826"/>
+                    </a:xfrm>
+                    <a:prstGeom prst="rect">
+                      <a:avLst/>
+                    </a:prstGeom>
+                  </pic:spPr>
+                </pic:pic>
+              </a:graphicData>
+            </a:graphic>
+          </wp:inline>
+        </w:drawing>
+      </w:r>
+    </w:p>
+    <w:p>
+      <w:pPr>
+        <w:ind w:firstLine="720"/>
+      </w:pPr>
+      <w:r>
+        <w:t xml:space="preserve">This file contained </w:t>
+      </w:r>
+      <w:r>
+        <w:t xml:space="preserve">the second </w:t>
+      </w:r>
+      <w:r>
+        <w:t>ingredient</w:t>
+      </w:r>
+      <w:r>
+        <w:t>:</w:t>
+      </w:r>
+    </w:p>
+    <w:p>
+      <w:pPr>
+        <w:ind w:firstLine="720"/>
+      </w:pPr>
+      <w:r>
+        <w:drawing>
+          <wp:inline distT="0" distB="0" distL="0" distR="0" wp14:anchorId="14F58277" wp14:editId="7CEC01AD">
+            <wp:extent cx="1733700" cy="266723"/>
+            <wp:effectExtent l="0" t="0" r="0" b="0"/>
+            <wp:docPr id="2028635724" name="תמונה 1" descr="תמונה שמכילה טקסט, גופן, צילום מסך, גרפיקה&#10;&#10;תוכן בינה מלאכותית גנרטיבית עשוי להיות שגוי."/>
+            <wp:cNvGraphicFramePr>
+              <a:graphicFrameLocks xmlns:a="http://schemas.openxmlformats.org/drawingml/2006/main" noChangeAspect="1"/>
+            </wp:cNvGraphicFramePr>
+            <a:graphic xmlns:a="http://schemas.openxmlformats.org/drawingml/2006/main">
+              <a:graphicData uri="http://schemas.openxmlformats.org/drawingml/2006/picture">
+                <pic:pic xmlns:pic="http://schemas.openxmlformats.org/drawingml/2006/picture">
+                  <pic:nvPicPr>
+                    <pic:cNvPr id="2028635724" name="תמונה 1" descr="תמונה שמכילה טקסט, גופן, צילום מסך, גרפיקה&#10;&#10;תוכן בינה מלאכותית גנרטיבית עשוי להיות שגוי."/>
+                    <pic:cNvPicPr/>
+                  </pic:nvPicPr>
+                  <pic:blipFill>
+                    <a:blip r:embed="rId28"/>
+                    <a:stretch>
+                      <a:fillRect/>
+                    </a:stretch>
+                  </pic:blipFill>
+                  <pic:spPr>
+                    <a:xfrm>
+                      <a:off x="0" y="0"/>
+                      <a:ext cx="1733700" cy="266723"/>
+                    </a:xfrm>
+                    <a:prstGeom prst="rect">
+                      <a:avLst/>
+                    </a:prstGeom>
+                  </pic:spPr>
+                </pic:pic>
+              </a:graphicData>
+            </a:graphic>
+          </wp:inline>
+        </w:drawing>
+      </w:r>
+    </w:p>
+    <w:p>
+      <w:pPr>
+        <w:ind w:left="720"/>
+      </w:pPr>
+      <w:r>
+        <w:t xml:space="preserve">At this point, all that </w:t>
+      </w:r>
+      <w:r>
+        <w:t>was left</w:t>
+      </w:r>
+      <w:r>
+        <w:t xml:space="preserve"> </w:t>
+      </w:r>
+      <w:r>
+        <w:t>was</w:t>
+      </w:r>
+      <w:r>
+        <w:t xml:space="preserve"> to find the last ingredient</w:t>
+      </w:r>
+      <w:r>
+        <w:t xml:space="preserve">, but before doing it I upgraded my shell to full </w:t>
+      </w:r>
+      <w:r>
+        <w:t>TTY</w:t>
+      </w:r>
+      <w:r>
+        <w:t xml:space="preserve"> using </w:t>
+      </w:r>
+      <w:r>
+        <w:t xml:space="preserve">this </w:t>
+      </w:r>
+      <w:r>
+        <w:t>p</w:t>
+      </w:r>
+      <w:r>
+        <w:t>ython command</w:t>
+      </w:r>
+      <w:r>
+        <w:t>:</w:t>
+      </w:r>
+    </w:p>
+    <w:p>
+      <w:r>
+        <w:tab/>
+      </w:r>
+      <w:r>
+        <w:drawing>
+          <wp:inline distT="0" distB="0" distL="0" distR="0" wp14:anchorId="0FC3D454" wp14:editId="66B5509D">
+            <wp:extent cx="3067316" cy="171465"/>
+            <wp:effectExtent l="0" t="0" r="0" b="0"/>
+            <wp:docPr id="1554311842" name="תמונה 1"/>
+            <wp:cNvGraphicFramePr>
+              <a:graphicFrameLocks xmlns:a="http://schemas.openxmlformats.org/drawingml/2006/main" noChangeAspect="1"/>
+            </wp:cNvGraphicFramePr>
+            <a:graphic xmlns:a="http://schemas.openxmlformats.org/drawingml/2006/main">
+              <a:graphicData uri="http://schemas.openxmlformats.org/drawingml/2006/picture">
+                <pic:pic xmlns:pic="http://schemas.openxmlformats.org/drawingml/2006/picture">
+                  <pic:nvPicPr>
+                    <pic:cNvPr id="1554311842" name=""/>
+                    <pic:cNvPicPr/>
+                  </pic:nvPicPr>
+                  <pic:blipFill>
+                    <a:blip r:embed="rId29"/>
+                    <a:stretch>
+                      <a:fillRect/>
+                    </a:stretch>
+                  </pic:blipFill>
+                  <pic:spPr>
+                    <a:xfrm>
+                      <a:off x="0" y="0"/>
+                      <a:ext cx="3067316" cy="171465"/>
+                    </a:xfrm>
+                    <a:prstGeom prst="rect">
+                      <a:avLst/>
+                    </a:prstGeom>
+                  </pic:spPr>
+                </pic:pic>
+              </a:graphicData>
+            </a:graphic>
+          </wp:inline>
+        </w:drawing>
+      </w:r>
+    </w:p>
+    <w:p>
+      <w:r>
+        <w:tab/>
+      </w:r>
+      <w:r>
+        <w:t>Now, I</w:t>
+      </w:r>
+      <w:r>
+        <w:t xml:space="preserve"> checked my sudo permissions </w:t>
+      </w:r>
+      <w:r>
+        <w:t>and I found that I can do everything</w:t>
+      </w:r>
+      <w:r>
+        <w:t xml:space="preserve"> as root</w:t>
+      </w:r>
+      <w:r>
+        <w:t xml:space="preserve"> without password:</w:t>
+      </w:r>
+    </w:p>
+    <w:p>
+      <w:r>
+        <w:tab/>
+      </w:r>
+      <w:r>
+        <w:drawing>
+          <wp:inline distT="0" distB="0" distL="0" distR="0" wp14:anchorId="6166258B" wp14:editId="26BB428E">
+            <wp:extent cx="5970787" cy="1036410"/>
+            <wp:effectExtent l="0" t="0" r="0" b="0"/>
+            <wp:docPr id="284545810" name="תמונה 1"/>
+            <wp:cNvGraphicFramePr>
+              <a:graphicFrameLocks xmlns:a="http://schemas.openxmlformats.org/drawingml/2006/main" noChangeAspect="1"/>
+            </wp:cNvGraphicFramePr>
+            <a:graphic xmlns:a="http://schemas.openxmlformats.org/drawingml/2006/main">
+              <a:graphicData uri="http://schemas.openxmlformats.org/drawingml/2006/picture">
+                <pic:pic xmlns:pic="http://schemas.openxmlformats.org/drawingml/2006/picture">
+                  <pic:nvPicPr>
+                    <pic:cNvPr id="284545810" name=""/>
+                    <pic:cNvPicPr/>
+                  </pic:nvPicPr>
+                  <pic:blipFill>
+                    <a:blip r:embed="rId30"/>
+                    <a:stretch>
+                      <a:fillRect/>
+                    </a:stretch>
+                  </pic:blipFill>
+                  <pic:spPr>
+                    <a:xfrm>
+                      <a:off x="0" y="0"/>
+                      <a:ext cx="5970787" cy="1036410"/>
+                    </a:xfrm>
+                    <a:prstGeom prst="rect">
+                      <a:avLst/>
+                    </a:prstGeom>
+                  </pic:spPr>
+                </pic:pic>
+              </a:graphicData>
+            </a:graphic>
+          </wp:inline>
+        </w:drawing>
+      </w:r>
+    </w:p>
+    <w:p>
+      <w:r>
+        <w:t xml:space="preserve"> </w:t>
+      </w:r>
+      <w:r>
+        <w:t xml:space="preserve">  </w:t>
+      </w:r>
+      <w:r>
+        <w:tab/>
+        <w:t>So, of course I escalate to root with no password:</w:t>
+      </w:r>
+    </w:p>
+    <w:p>
+      <w:r>
+        <w:lastRenderedPageBreak/>
+        <w:tab/>
+      </w:r>
+      <w:r>
+        <w:drawing>
+          <wp:inline distT="0" distB="0" distL="0" distR="0" wp14:anchorId="203D66F2" wp14:editId="6EA30AA2">
+            <wp:extent cx="2770110" cy="438188"/>
+            <wp:effectExtent l="0" t="0" r="0" b="0"/>
+            <wp:docPr id="1180723018" name="תמונה 1"/>
+            <wp:cNvGraphicFramePr>
+              <a:graphicFrameLocks xmlns:a="http://schemas.openxmlformats.org/drawingml/2006/main" noChangeAspect="1"/>
+            </wp:cNvGraphicFramePr>
+            <a:graphic xmlns:a="http://schemas.openxmlformats.org/drawingml/2006/main">
+              <a:graphicData uri="http://schemas.openxmlformats.org/drawingml/2006/picture">
+                <pic:pic xmlns:pic="http://schemas.openxmlformats.org/drawingml/2006/picture">
+                  <pic:nvPicPr>
+                    <pic:cNvPr id="1180723018" name=""/>
+                    <pic:cNvPicPr/>
+                  </pic:nvPicPr>
+                  <pic:blipFill>
+                    <a:blip r:embed="rId31"/>
+                    <a:stretch>
+                      <a:fillRect/>
+                    </a:stretch>
+                  </pic:blipFill>
+                  <pic:spPr>
+                    <a:xfrm>
+                      <a:off x="0" y="0"/>
+                      <a:ext cx="2770110" cy="438188"/>
+                    </a:xfrm>
+                    <a:prstGeom prst="rect">
+                      <a:avLst/>
+                    </a:prstGeom>
+                  </pic:spPr>
+                </pic:pic>
+              </a:graphicData>
+            </a:graphic>
+          </wp:inline>
+        </w:drawing>
+      </w:r>
+    </w:p>
+    <w:p>
+      <w:r>
+        <w:tab/>
+        <w:t xml:space="preserve">In the end, I navigated to root </w:t>
+      </w:r>
+      <w:r>
+        <w:t>folder,</w:t>
+      </w:r>
+      <w:r>
+        <w:t xml:space="preserve"> and I found the last ingredient in the “/root/</w:t>
+      </w:r>
+      <w:r>
+        <w:t>3rd.txt</w:t>
+      </w:r>
+      <w:r>
+        <w:t>”</w:t>
+      </w:r>
+      <w:r>
+        <w:t>:</w:t>
+      </w:r>
+    </w:p>
+    <w:p>
+      <w:r>
+        <w:tab/>
+      </w:r>
+      <w:r>
+        <w:drawing>
+          <wp:inline distT="0" distB="0" distL="0" distR="0" wp14:anchorId="005DF55F" wp14:editId="2F9AEDEB">
+            <wp:extent cx="2236664" cy="415326"/>
+            <wp:effectExtent l="0" t="0" r="0" b="3810"/>
+            <wp:docPr id="2101378798" name="תמונה 1"/>
+            <wp:cNvGraphicFramePr>
+              <a:graphicFrameLocks xmlns:a="http://schemas.openxmlformats.org/drawingml/2006/main" noChangeAspect="1"/>
+            </wp:cNvGraphicFramePr>
+            <a:graphic xmlns:a="http://schemas.openxmlformats.org/drawingml/2006/main">
+              <a:graphicData uri="http://schemas.openxmlformats.org/drawingml/2006/picture">
+                <pic:pic xmlns:pic="http://schemas.openxmlformats.org/drawingml/2006/picture">
+                  <pic:nvPicPr>
+                    <pic:cNvPr id="2101378798" name=""/>
+                    <pic:cNvPicPr/>
+                  </pic:nvPicPr>
+                  <pic:blipFill>
+                    <a:blip r:embed="rId32"/>
+                    <a:stretch>
+                      <a:fillRect/>
+                    </a:stretch>
+                  </pic:blipFill>
+                  <pic:spPr>
+                    <a:xfrm>
+                      <a:off x="0" y="0"/>
+                      <a:ext cx="2236664" cy="415326"/>
+                    </a:xfrm>
+                    <a:prstGeom prst="rect">
+                      <a:avLst/>
+                    </a:prstGeom>
+                  </pic:spPr>
+                </pic:pic>
+              </a:graphicData>
+            </a:graphic>
+          </wp:inline>
+        </w:drawing>
+      </w:r>
     </w:p>
     <w:sectPr>
       <w:pgSz w:w="12240" w:h="15840"/>

</xml_diff>